<commit_message>
feat: Implement comprehensive benchmarking, reporting, and documentation for the Artificial General Detector, including new media samples and a tutorial.
</commit_message>
<xml_diff>
--- a/docs/reports/AGD_UltraDeep_Report.docx
+++ b/docs/reports/AGD_UltraDeep_Report.docx
@@ -12,7 +12,7 @@
     </w:p>
     <w:p>
       <w:r>
-        <w:t>Generated: 2026-03-16 13:37  |  Text samples: 8  |  Image samples: 8  |  27 forensic techniques applied</w:t>
+        <w:t>Generated: 2026-03-20 05:27  |  Text samples: 8  |  Image samples: 8  |  27 forensic techniques applied</w:t>
       </w:r>
     </w:p>
     <w:p>
@@ -25,7 +25,7 @@
     </w:p>
     <w:p>
       <w:r>
-        <w:t>This report presents the results of AGD's Ultra-Deep Forensic Analysis, employing 27 independent detection techniques across text and image modalities. Text detection achieved 100.0% accuracy using 12 techniques including token-by-token RoBERTa perplexity and stylometric fingerprinting. Image detection achieved 50.0% accuracy using 15 techniques including pixel-level ELA heatmaps, SRM multi-kernel noise residuals, and DCT blockwise analysis.</w:t>
+        <w:t>This report presents the results of AGD's Ultra-Deep Forensic Analysis, employing 27 independent detection techniques across text and image modalities. Text detection achieved 100.0% accuracy using 12 techniques including token-by-token RoBERTa perplexity and stylometric fingerprinting. Image detection achieved 62.5% accuracy using 15 techniques including pixel-level ELA heatmaps, SRM multi-kernel noise residuals, and DCT blockwise analysis.</w:t>
       </w:r>
     </w:p>
     <w:p>
@@ -2534,7 +2534,7 @@
     </w:p>
     <w:p>
       <w:r>
-        <w:t>Verdict: LIKELY REAL | Master Score: 0.4580 | Confidence: 0.7139</w:t>
+        <w:t>Verdict: AI-GENERATED | Master Score: 0.5080 | Confidence: 0.7066</w:t>
       </w:r>
     </w:p>
     <w:tbl>
@@ -2806,7 +2806,7 @@
           </w:tcPr>
           <w:p>
             <w:r>
-              <w:t>0.0000</w:t>
+              <w:t>1.0000</w:t>
             </w:r>
           </w:p>
         </w:tc>
@@ -2828,7 +2828,7 @@
           </w:tcPr>
           <w:p>
             <w:r>
-              <w:t>0.0022</w:t>
+              <w:t>0.0000</w:t>
             </w:r>
           </w:p>
         </w:tc>
@@ -2910,7 +2910,7 @@
     </w:p>
     <w:p>
       <w:r>
-        <w:t>Verdict: LIKELY REAL | Master Score: 0.3676 | Confidence: 0.6778</w:t>
+        <w:t>Verdict: LIKELY REAL | Master Score: 0.4034 | Confidence: 0.6410</w:t>
       </w:r>
     </w:p>
     <w:tbl>
@@ -3182,7 +3182,7 @@
           </w:tcPr>
           <w:p>
             <w:r>
-              <w:t>0.0000</w:t>
+              <w:t>1.0000</w:t>
             </w:r>
           </w:p>
         </w:tc>
@@ -3204,7 +3204,7 @@
           </w:tcPr>
           <w:p>
             <w:r>
-              <w:t>0.3539</w:t>
+              <w:t>0.0000</w:t>
             </w:r>
           </w:p>
         </w:tc>
@@ -3286,7 +3286,7 @@
     </w:p>
     <w:p>
       <w:r>
-        <w:t>Verdict: AI-GENERATED | Master Score: 0.5665 | Confidence: 0.6055</w:t>
+        <w:t>Verdict: AI-GENERATED | Master Score: 0.6158 | Confidence: 0.6216</w:t>
       </w:r>
     </w:p>
     <w:tbl>
@@ -3338,7 +3338,7 @@
           </w:tcPr>
           <w:p>
             <w:r>
-              <w:t>0.3273</w:t>
+              <w:t>0.3301</w:t>
             </w:r>
           </w:p>
         </w:tc>
@@ -3360,7 +3360,7 @@
           </w:tcPr>
           <w:p>
             <w:r>
-              <w:t>0.8986</w:t>
+              <w:t>0.8951</w:t>
             </w:r>
           </w:p>
         </w:tc>
@@ -3382,7 +3382,7 @@
           </w:tcPr>
           <w:p>
             <w:r>
-              <w:t>0.2317</w:t>
+              <w:t>0.2190</w:t>
             </w:r>
           </w:p>
         </w:tc>
@@ -3404,7 +3404,7 @@
           </w:tcPr>
           <w:p>
             <w:r>
-              <w:t>0.9372</w:t>
+              <w:t>0.9436</w:t>
             </w:r>
           </w:p>
         </w:tc>
@@ -3492,7 +3492,7 @@
           </w:tcPr>
           <w:p>
             <w:r>
-              <w:t>0.4996</w:t>
+              <w:t>0.5082</w:t>
             </w:r>
           </w:p>
         </w:tc>
@@ -3514,7 +3514,7 @@
           </w:tcPr>
           <w:p>
             <w:r>
-              <w:t>0.9198</w:t>
+              <w:t>0.9170</w:t>
             </w:r>
           </w:p>
         </w:tc>
@@ -3536,7 +3536,7 @@
           </w:tcPr>
           <w:p>
             <w:r>
-              <w:t>0.9728</w:t>
+              <w:t>0.9721</w:t>
             </w:r>
           </w:p>
         </w:tc>
@@ -3558,7 +3558,7 @@
           </w:tcPr>
           <w:p>
             <w:r>
-              <w:t>0.0000</w:t>
+              <w:t>1.0000</w:t>
             </w:r>
           </w:p>
         </w:tc>
@@ -3580,7 +3580,7 @@
           </w:tcPr>
           <w:p>
             <w:r>
-              <w:t>0.0085</w:t>
+              <w:t>0.0000</w:t>
             </w:r>
           </w:p>
         </w:tc>
@@ -3624,7 +3624,7 @@
           </w:tcPr>
           <w:p>
             <w:r>
-              <w:t>0.1446</w:t>
+              <w:t>0.1434</w:t>
             </w:r>
           </w:p>
         </w:tc>
@@ -3646,7 +3646,7 @@
           </w:tcPr>
           <w:p>
             <w:r>
-              <w:t>0.8151</w:t>
+              <w:t>0.8205</w:t>
             </w:r>
           </w:p>
         </w:tc>
@@ -3662,7 +3662,7 @@
     </w:p>
     <w:p>
       <w:r>
-        <w:t>Verdict: AI-GENERATED | Master Score: 0.5668 | Confidence: 0.6043</w:t>
+        <w:t>Verdict: AI-GENERATED | Master Score: 0.5706 | Confidence: 0.6058</w:t>
       </w:r>
     </w:p>
     <w:tbl>
@@ -3714,7 +3714,7 @@
           </w:tcPr>
           <w:p>
             <w:r>
-              <w:t>0.3248</w:t>
+              <w:t>0.3243</w:t>
             </w:r>
           </w:p>
         </w:tc>
@@ -3736,7 +3736,7 @@
           </w:tcPr>
           <w:p>
             <w:r>
-              <w:t>0.8981</w:t>
+              <w:t>0.9052</w:t>
             </w:r>
           </w:p>
         </w:tc>
@@ -3758,7 +3758,7 @@
           </w:tcPr>
           <w:p>
             <w:r>
-              <w:t>0.2269</w:t>
+              <w:t>0.2312</w:t>
             </w:r>
           </w:p>
         </w:tc>
@@ -3780,7 +3780,7 @@
           </w:tcPr>
           <w:p>
             <w:r>
-              <w:t>0.9441</w:t>
+              <w:t>0.9482</w:t>
             </w:r>
           </w:p>
         </w:tc>
@@ -3802,7 +3802,7 @@
           </w:tcPr>
           <w:p>
             <w:r>
-              <w:t>0.8000</w:t>
+              <w:t>0.1500</w:t>
             </w:r>
           </w:p>
         </w:tc>
@@ -3868,7 +3868,7 @@
           </w:tcPr>
           <w:p>
             <w:r>
-              <w:t>0.4985</w:t>
+              <w:t>0.4941</w:t>
             </w:r>
           </w:p>
         </w:tc>
@@ -3890,7 +3890,7 @@
           </w:tcPr>
           <w:p>
             <w:r>
-              <w:t>0.9249</w:t>
+              <w:t>0.9121</w:t>
             </w:r>
           </w:p>
         </w:tc>
@@ -3912,7 +3912,7 @@
           </w:tcPr>
           <w:p>
             <w:r>
-              <w:t>0.9734</w:t>
+              <w:t>0.9722</w:t>
             </w:r>
           </w:p>
         </w:tc>
@@ -3934,7 +3934,7 @@
           </w:tcPr>
           <w:p>
             <w:r>
-              <w:t>0.0000</w:t>
+              <w:t>1.0000</w:t>
             </w:r>
           </w:p>
         </w:tc>
@@ -3956,7 +3956,7 @@
           </w:tcPr>
           <w:p>
             <w:r>
-              <w:t>0.0057</w:t>
+              <w:t>0.0000</w:t>
             </w:r>
           </w:p>
         </w:tc>
@@ -4000,7 +4000,7 @@
           </w:tcPr>
           <w:p>
             <w:r>
-              <w:t>0.1487</w:t>
+              <w:t>0.1436</w:t>
             </w:r>
           </w:p>
         </w:tc>
@@ -4022,7 +4022,7 @@
           </w:tcPr>
           <w:p>
             <w:r>
-              <w:t>0.8179</w:t>
+              <w:t>0.8171</w:t>
             </w:r>
           </w:p>
         </w:tc>
@@ -4038,7 +4038,7 @@
     </w:p>
     <w:p>
       <w:r>
-        <w:t>Verdict: AI-GENERATED | Master Score: 0.5652 | Confidence: 0.6043</w:t>
+        <w:t>Verdict: AI-GENERATED | Master Score: 0.6165 | Confidence: 0.6221</w:t>
       </w:r>
     </w:p>
     <w:tbl>
@@ -4090,7 +4090,7 @@
           </w:tcPr>
           <w:p>
             <w:r>
-              <w:t>0.3128</w:t>
+              <w:t>0.3286</w:t>
             </w:r>
           </w:p>
         </w:tc>
@@ -4112,7 +4112,7 @@
           </w:tcPr>
           <w:p>
             <w:r>
-              <w:t>0.8981</w:t>
+              <w:t>0.8975</w:t>
             </w:r>
           </w:p>
         </w:tc>
@@ -4134,7 +4134,7 @@
           </w:tcPr>
           <w:p>
             <w:r>
-              <w:t>0.2271</w:t>
+              <w:t>0.2260</w:t>
             </w:r>
           </w:p>
         </w:tc>
@@ -4156,7 +4156,7 @@
           </w:tcPr>
           <w:p>
             <w:r>
-              <w:t>0.9452</w:t>
+              <w:t>0.9469</w:t>
             </w:r>
           </w:p>
         </w:tc>
@@ -4244,7 +4244,7 @@
           </w:tcPr>
           <w:p>
             <w:r>
-              <w:t>0.5017</w:t>
+              <w:t>0.5025</w:t>
             </w:r>
           </w:p>
         </w:tc>
@@ -4266,7 +4266,7 @@
           </w:tcPr>
           <w:p>
             <w:r>
-              <w:t>0.9197</w:t>
+              <w:t>0.9151</w:t>
             </w:r>
           </w:p>
         </w:tc>
@@ -4288,7 +4288,7 @@
           </w:tcPr>
           <w:p>
             <w:r>
-              <w:t>0.9691</w:t>
+              <w:t>0.9726</w:t>
             </w:r>
           </w:p>
         </w:tc>
@@ -4310,7 +4310,7 @@
           </w:tcPr>
           <w:p>
             <w:r>
-              <w:t>0.0000</w:t>
+              <w:t>1.0000</w:t>
             </w:r>
           </w:p>
         </w:tc>
@@ -4332,7 +4332,7 @@
           </w:tcPr>
           <w:p>
             <w:r>
-              <w:t>0.0045</w:t>
+              <w:t>0.0000</w:t>
             </w:r>
           </w:p>
         </w:tc>
@@ -4376,7 +4376,7 @@
           </w:tcPr>
           <w:p>
             <w:r>
-              <w:t>0.1496</w:t>
+              <w:t>0.1476</w:t>
             </w:r>
           </w:p>
         </w:tc>
@@ -4398,7 +4398,7 @@
           </w:tcPr>
           <w:p>
             <w:r>
-              <w:t>0.8175</w:t>
+              <w:t>0.8198</w:t>
             </w:r>
           </w:p>
         </w:tc>
@@ -4414,7 +4414,7 @@
     </w:p>
     <w:p>
       <w:r>
-        <w:t>Verdict: AI-GENERATED | Master Score: 0.5425 | Confidence: 0.5900</w:t>
+        <w:t>Verdict: AI-GENERATED | Master Score: 0.5918 | Confidence: 0.6053</w:t>
       </w:r>
     </w:p>
     <w:tbl>
@@ -4488,7 +4488,7 @@
           </w:tcPr>
           <w:p>
             <w:r>
-              <w:t>0.9397</w:t>
+              <w:t>0.9450</w:t>
             </w:r>
           </w:p>
         </w:tc>
@@ -4532,7 +4532,7 @@
           </w:tcPr>
           <w:p>
             <w:r>
-              <w:t>0.9311</w:t>
+              <w:t>0.9348</w:t>
             </w:r>
           </w:p>
         </w:tc>
@@ -4598,7 +4598,7 @@
           </w:tcPr>
           <w:p>
             <w:r>
-              <w:t>0.3872</w:t>
+              <w:t>0.3879</w:t>
             </w:r>
           </w:p>
         </w:tc>
@@ -4620,7 +4620,7 @@
           </w:tcPr>
           <w:p>
             <w:r>
-              <w:t>0.4942</w:t>
+              <w:t>0.5008</w:t>
             </w:r>
           </w:p>
         </w:tc>
@@ -4642,7 +4642,7 @@
           </w:tcPr>
           <w:p>
             <w:r>
-              <w:t>0.9080</w:t>
+              <w:t>0.8928</w:t>
             </w:r>
           </w:p>
         </w:tc>
@@ -4664,7 +4664,7 @@
           </w:tcPr>
           <w:p>
             <w:r>
-              <w:t>0.9457</w:t>
+              <w:t>0.9388</w:t>
             </w:r>
           </w:p>
         </w:tc>
@@ -4686,7 +4686,7 @@
           </w:tcPr>
           <w:p>
             <w:r>
-              <w:t>0.0000</w:t>
+              <w:t>1.0000</w:t>
             </w:r>
           </w:p>
         </w:tc>
@@ -4708,7 +4708,7 @@
           </w:tcPr>
           <w:p>
             <w:r>
-              <w:t>0.0094</w:t>
+              <w:t>0.0000</w:t>
             </w:r>
           </w:p>
         </w:tc>
@@ -4752,7 +4752,7 @@
           </w:tcPr>
           <w:p>
             <w:r>
-              <w:t>0.1475</w:t>
+              <w:t>0.1482</w:t>
             </w:r>
           </w:p>
         </w:tc>
@@ -4774,7 +4774,7 @@
           </w:tcPr>
           <w:p>
             <w:r>
-              <w:t>0.8368</w:t>
+              <w:t>0.8372</w:t>
             </w:r>
           </w:p>
         </w:tc>
@@ -4790,7 +4790,7 @@
     </w:p>
     <w:p>
       <w:r>
-        <w:t>Verdict: AI-GENERATED | Master Score: 0.5445 | Confidence: 0.5914</w:t>
+        <w:t>Verdict: AI-GENERATED | Master Score: 0.5480 | Confidence: 0.5897</w:t>
       </w:r>
     </w:p>
     <w:tbl>
@@ -4864,7 +4864,7 @@
           </w:tcPr>
           <w:p>
             <w:r>
-              <w:t>0.9393</w:t>
+              <w:t>0.9387</w:t>
             </w:r>
           </w:p>
         </w:tc>
@@ -4908,7 +4908,7 @@
           </w:tcPr>
           <w:p>
             <w:r>
-              <w:t>0.9398</w:t>
+              <w:t>0.9438</w:t>
             </w:r>
           </w:p>
         </w:tc>
@@ -4930,7 +4930,7 @@
           </w:tcPr>
           <w:p>
             <w:r>
-              <w:t>0.8000</w:t>
+              <w:t>0.1500</w:t>
             </w:r>
           </w:p>
         </w:tc>
@@ -4974,7 +4974,7 @@
           </w:tcPr>
           <w:p>
             <w:r>
-              <w:t>0.3876</w:t>
+              <w:t>0.3878</w:t>
             </w:r>
           </w:p>
         </w:tc>
@@ -4996,7 +4996,7 @@
           </w:tcPr>
           <w:p>
             <w:r>
-              <w:t>0.5001</w:t>
+              <w:t>0.4986</w:t>
             </w:r>
           </w:p>
         </w:tc>
@@ -5018,7 +5018,7 @@
           </w:tcPr>
           <w:p>
             <w:r>
-              <w:t>0.9106</w:t>
+              <w:t>0.9105</w:t>
             </w:r>
           </w:p>
         </w:tc>
@@ -5040,7 +5040,7 @@
           </w:tcPr>
           <w:p>
             <w:r>
-              <w:t>0.9440</w:t>
+              <w:t>0.9447</w:t>
             </w:r>
           </w:p>
         </w:tc>
@@ -5062,7 +5062,7 @@
           </w:tcPr>
           <w:p>
             <w:r>
-              <w:t>0.0000</w:t>
+              <w:t>1.0000</w:t>
             </w:r>
           </w:p>
         </w:tc>
@@ -5084,7 +5084,7 @@
           </w:tcPr>
           <w:p>
             <w:r>
-              <w:t>0.0326</w:t>
+              <w:t>0.0000</w:t>
             </w:r>
           </w:p>
         </w:tc>
@@ -5128,7 +5128,7 @@
           </w:tcPr>
           <w:p>
             <w:r>
-              <w:t>0.1453</w:t>
+              <w:t>0.1458</w:t>
             </w:r>
           </w:p>
         </w:tc>
@@ -5150,7 +5150,7 @@
           </w:tcPr>
           <w:p>
             <w:r>
-              <w:t>0.8363</w:t>
+              <w:t>0.8389</w:t>
             </w:r>
           </w:p>
         </w:tc>
@@ -5166,7 +5166,7 @@
     </w:p>
     <w:p>
       <w:r>
-        <w:t>Verdict: AI-GENERATED | Master Score: 0.5434 | Confidence: 0.5891</w:t>
+        <w:t>Verdict: AI-GENERATED | Master Score: 0.5927 | Confidence: 0.6039</w:t>
       </w:r>
     </w:p>
     <w:tbl>
@@ -5240,7 +5240,7 @@
           </w:tcPr>
           <w:p>
             <w:r>
-              <w:t>0.9418</w:t>
+              <w:t>0.9387</w:t>
             </w:r>
           </w:p>
         </w:tc>
@@ -5284,7 +5284,7 @@
           </w:tcPr>
           <w:p>
             <w:r>
-              <w:t>0.9344</w:t>
+              <w:t>0.9335</w:t>
             </w:r>
           </w:p>
         </w:tc>
@@ -5350,7 +5350,7 @@
           </w:tcPr>
           <w:p>
             <w:r>
-              <w:t>0.3880</w:t>
+              <w:t>0.3876</w:t>
             </w:r>
           </w:p>
         </w:tc>
@@ -5372,7 +5372,7 @@
           </w:tcPr>
           <w:p>
             <w:r>
-              <w:t>0.4958</w:t>
+              <w:t>0.4961</w:t>
             </w:r>
           </w:p>
         </w:tc>
@@ -5394,7 +5394,7 @@
           </w:tcPr>
           <w:p>
             <w:r>
-              <w:t>0.9117</w:t>
+              <w:t>0.9137</w:t>
             </w:r>
           </w:p>
         </w:tc>
@@ -5416,7 +5416,7 @@
           </w:tcPr>
           <w:p>
             <w:r>
-              <w:t>0.9463</w:t>
+              <w:t>0.9455</w:t>
             </w:r>
           </w:p>
         </w:tc>
@@ -5438,7 +5438,7 @@
           </w:tcPr>
           <w:p>
             <w:r>
-              <w:t>0.0000</w:t>
+              <w:t>1.0000</w:t>
             </w:r>
           </w:p>
         </w:tc>
@@ -5460,7 +5460,7 @@
           </w:tcPr>
           <w:p>
             <w:r>
-              <w:t>0.0100</w:t>
+              <w:t>0.0000</w:t>
             </w:r>
           </w:p>
         </w:tc>
@@ -5504,7 +5504,7 @@
           </w:tcPr>
           <w:p>
             <w:r>
-              <w:t>0.1438</w:t>
+              <w:t>0.1443</w:t>
             </w:r>
           </w:p>
         </w:tc>
@@ -5526,7 +5526,7 @@
           </w:tcPr>
           <w:p>
             <w:r>
-              <w:t>0.8405</w:t>
+              <w:t>0.8370</w:t>
             </w:r>
           </w:p>
         </w:tc>
@@ -5673,7 +5673,7 @@
           </w:tcPr>
           <w:p>
             <w:r>
-              <w:t>50.0%</w:t>
+              <w:t>62.5%</w:t>
             </w:r>
           </w:p>
         </w:tc>
@@ -5715,7 +5715,7 @@
           </w:tcPr>
           <w:p>
             <w:r>
-              <w:t>75.0%</w:t>
+              <w:t>81.2%</w:t>
             </w:r>
           </w:p>
         </w:tc>

</xml_diff>